<commit_message>
Remove scripture quotations: drop them from pages, template, examples and builder
Co-Authored-By: Claude Sonnet 5.5 <noreply@anthropic.com>
Claude-Session: https://claude.ai/code/session_01AFttd4ZhKzSUEiUAhU2CQq
</commit_message>
<xml_diff>
--- a/submissions/Daniel 7 (example chapter).docx
+++ b/submissions/Daniel 7 (example chapter).docx
@@ -660,19 +660,12 @@
       </w:r>
     </w:p>
     <w:p>
-      <w:pPr>
-        <w:pStyle w:val="Scripture"/>
-      </w:pPr>
+      <w:pPr/>
       <w:r>
-        <w:t>“And there was given him dominion, and glory, and a kingdom, that all people, nations, and languages, should serve him: his dominion is an everlasting dominion, which shall not pass away, and his kingdom that which shall not be destroyed.”</w:t>
-      </w:r>
-    </w:p>
-    <w:p>
-      <w:pPr>
-        <w:pStyle w:val="ScriptureReference"/>
-      </w:pPr>
-      <w:r>
-        <w:t>Daniel 7:14</w:t>
+        <w:rPr>
+          <w:i w:val="0"/>
+        </w:rPr>
+        <w:t>Read Daniel 7:14 in your own Bible.</w:t>
       </w:r>
     </w:p>
     <w:p>

</xml_diff>